<commit_message>
feat: public uploads, optional verification, Pro plan display and motion
- Uploads are public as soon as they're shared; moderator approval is gone.
- Authors can request free verification of a version; the verifier works a
  Verification queue (requested, reported, all public) and marks versions
  verified. Reports still hide a pack until it is restored.
- Pro plan (priority verification, more storage, bookmark folders) is shown
  in an upgrade dialog from five entry points; it is display-only.
- State schema 4 migrates older saved pending packs to public.
- Scroll/fade reveals, homepage intro, card hover/press and page fade with
  reduced-motion variants; UI polish pass on shared primitives.
- Also includes pending work: profiles, revisions, settings, sign-in,
  version history, new fictional samples and logo.
- README rewritten with requirements, setup and a walkthrough; DEMO, PLAN
  and PROJECT_MEMORY updated.

Co-Authored-By: Claude Opus 5.5 <noreply@anthropic.com>
</commit_message>
<xml_diff>
--- a/public/samples/bibingka-fractions-lesson-plan.docx
+++ b/public/samples/bibingka-fractions-lesson-plan.docx
@@ -16,7 +16,7 @@
         <w:rPr>
           <w:sz w:val="20"/>
         </w:rPr>
-        <w:t xml:space="preserve">Grade 3 Mathematics. Version 1.0. Shared by Ma'am Tess (demo persona).</w:t>
+        <w:t xml:space="preserve">Grade 3 · Mathematics · Quarter 2, Week 4</w:t>
       </w:r>
     </w:p>
     <w:p>
@@ -24,16 +24,15 @@
         <w:rPr>
           <w:sz w:val="20"/>
         </w:rPr>
-        <w:t xml:space="preserve">Illustrative competency EX-MATH3-T2-06 (example, not official alignment): Represent and compare unit fractions</w:t>
+        <w:t xml:space="preserve">Prepared by Ma'am Tess Obias, Virac Pilot Elementary School. Version 1.0.</w:t>
       </w:r>
     </w:p>
     <w:p>
       <w:r>
         <w:rPr>
-          <w:i/>
           <w:sz w:val="20"/>
         </w:rPr>
-        <w:t xml:space="preserve">Fictional sample created by the CherIt team for a hackathon demonstration. Edit freely.</w:t>
+        <w:t xml:space="preserve">Competency: Represent and compare unit fractions (M3NS-IIIa-72.1)</w:t>
       </w:r>
     </w:p>
     <w:p>

</xml_diff>